<commit_message>
Fix day numbers in Word doc
</commit_message>
<xml_diff>
--- a/trip/Yellowstone_Detailed_Guide.docx
+++ b/trip/Yellowstone_Detailed_Guide.docx
@@ -20,12 +20,85 @@
         <w:pStyle w:val="Heading1"/>
       </w:pPr>
       <w:r>
-        <w:t>FLEXIBLE DAY A: The Grand Teton Drive (South)</w:t>
+        <w:t>DAY 2: Hayden Valley &amp; Grand Canyon (North)</w:t>
       </w:r>
     </w:p>
     <w:p>
       <w:r>
-        <w:t>FLEXIBILITY NOTE: Do this on the SUNNIEST day. If the mountains are hidden by rain/clouds, skip this and do the Canyon/Hayden Valley day instead.</w:t>
+        <w:t>ANIMAL WATCHING: Perfect for cooler weather! The mist makes the canyon dramatic and brings the animals out in Hayden Valley.</w:t>
+      </w:r>
+    </w:p>
+    <w:p>
+      <w:pPr>
+        <w:pStyle w:val="Heading2"/>
+      </w:pPr>
+      <w:r>
+        <w:t>1. Hayden Valley (7:45 AM)</w:t>
+      </w:r>
+    </w:p>
+    <w:p>
+      <w:r>
+        <w:t>- Logistics: Drive north from Grant Village. The valley spans several miles.</w:t>
+        <w:br/>
+        <w:t>- Details: Do not just drive straight through. Pull over at the "Alum Creek" or "Elk Antler Creek" pullouts. Turn off your car engine, roll down the windows, and just listen. You will likely see massive herds of bison, and if you use your binoculars along the tree line, you might spot grizzly bears or wolves.</w:t>
+      </w:r>
+    </w:p>
+    <w:p>
+      <w:pPr>
+        <w:pStyle w:val="Heading2"/>
+      </w:pPr>
+      <w:r>
+        <w:t>2. Artist Point / South Rim (8:30 AM)</w:t>
+      </w:r>
+    </w:p>
+    <w:p>
+      <w:r>
+        <w:t>- Logistics: Drive to the South Rim drive of the Canyon and park at the end.</w:t>
+        <w:br/>
+        <w:t>- Details: A very short 0.1-mile paved walk takes you to Artist Point. This is the classic, sweeping view of the 308-foot Lower Falls plunging into the yellow canyon. No strenuous hiking required.</w:t>
+      </w:r>
+    </w:p>
+    <w:p>
+      <w:pPr>
+        <w:pStyle w:val="Heading2"/>
+      </w:pPr>
+      <w:r>
+        <w:t>3. Brink of the Lower Falls / North Rim (9:30 AM)</w:t>
+      </w:r>
+    </w:p>
+    <w:p>
+      <w:r>
+        <w:t>- Logistics: Drive to the North Rim drive.</w:t>
+        <w:br/>
+        <w:t>- Details: This is a steep trail! It zig-zags down 600 feet into the canyon. At the bottom, you stand on a platform literally inches from the top of the massive waterfall as it drops off the cliff. (Remember, you have to hike back UP those 600 feet, so take your time and drink water).</w:t>
+      </w:r>
+    </w:p>
+    <w:p>
+      <w:pPr>
+        <w:pStyle w:val="Heading2"/>
+      </w:pPr>
+      <w:r>
+        <w:t>4. Storm Point Hike (1:30 PM)</w:t>
+      </w:r>
+    </w:p>
+    <w:p>
+      <w:r>
+        <w:t>- Logistics: Located east of Fishing Bridge along the lake.</w:t>
+        <w:br/>
+        <w:t>- Details: A flat, 2.3-mile loop trail. It takes you through a dense pine forest and pops out onto a beautiful, wind-swept beach on Yellowstone Lake. *WARNING: If there is a thunderstorm, skip this. It is extremely exposed to lightning.*</w:t>
+      </w:r>
+    </w:p>
+    <w:p>
+      <w:pPr>
+        <w:pStyle w:val="Heading1"/>
+      </w:pPr>
+      <w:r>
+        <w:t>DAY 3: The Grand Teton Drive (South)</w:t>
+      </w:r>
+    </w:p>
+    <w:p>
+      <w:r>
+        <w:t>MOUNTAIN DAY: A stunning drive south into the neighboring National Park.</w:t>
       </w:r>
     </w:p>
     <w:p>
@@ -97,80 +170,12 @@
         <w:pStyle w:val="Heading1"/>
       </w:pPr>
       <w:r>
-        <w:t>FLEXIBLE DAY B: Hayden Valley &amp; Grand Canyon (North)</w:t>
+        <w:t>DAY 4: Mammoth Hot Springs, Lamar Valley &amp; Departure</w:t>
       </w:r>
     </w:p>
     <w:p>
       <w:r>
-        <w:t>FLEXIBILITY NOTE: Do this on the RAINIER day. The mist makes the canyon dramatic and rain brings the animals out in Hayden Valley.</w:t>
-      </w:r>
-    </w:p>
-    <w:p>
-      <w:pPr>
-        <w:pStyle w:val="Heading2"/>
-      </w:pPr>
-      <w:r>
-        <w:t>1. Hayden Valley (7:45 AM)</w:t>
-      </w:r>
-    </w:p>
-    <w:p>
-      <w:r>
-        <w:t>- Logistics: Drive north from Grant Village. The valley spans several miles.</w:t>
-        <w:br/>
-        <w:t>- Details: Do not just drive straight through. Pull over at the "Alum Creek" or "Elk Antler Creek" pullouts. Turn off your car engine, roll down the windows, and just listen. You will likely see massive herds of bison, and if you use your binoculars along the tree line, you might spot grizzly bears or wolves.</w:t>
-      </w:r>
-    </w:p>
-    <w:p>
-      <w:pPr>
-        <w:pStyle w:val="Heading2"/>
-      </w:pPr>
-      <w:r>
-        <w:t>2. Artist Point / South Rim (8:30 AM)</w:t>
-      </w:r>
-    </w:p>
-    <w:p>
-      <w:r>
-        <w:t>- Logistics: Drive to the South Rim drive of the Canyon and park at the end.</w:t>
-        <w:br/>
-        <w:t>- Details: A very short 0.1-mile paved walk takes you to Artist Point. This is the classic, sweeping view of the 308-foot Lower Falls plunging into the yellow canyon. No strenuous hiking required.</w:t>
-      </w:r>
-    </w:p>
-    <w:p>
-      <w:pPr>
-        <w:pStyle w:val="Heading2"/>
-      </w:pPr>
-      <w:r>
-        <w:t>3. Brink of the Lower Falls / North Rim (9:30 AM)</w:t>
-      </w:r>
-    </w:p>
-    <w:p>
-      <w:r>
-        <w:t>- Logistics: Drive to the North Rim drive.</w:t>
-        <w:br/>
-        <w:t>- Details: This is a steep trail! It zig-zags down 600 feet into the canyon. At the bottom, you stand on a platform literally inches from the top of the massive waterfall as it drops off the cliff. (Remember, you have to hike back UP those 600 feet, so take your time and drink water).</w:t>
-      </w:r>
-    </w:p>
-    <w:p>
-      <w:pPr>
-        <w:pStyle w:val="Heading2"/>
-      </w:pPr>
-      <w:r>
-        <w:t>4. Storm Point Hike (1:30 PM)</w:t>
-      </w:r>
-    </w:p>
-    <w:p>
-      <w:r>
-        <w:t>- Logistics: Located east of Fishing Bridge along the lake.</w:t>
-        <w:br/>
-        <w:t>- Details: A flat, 2.3-mile loop trail. It takes you through a dense pine forest and pops out onto a beautiful, wind-swept beach on Yellowstone Lake. *WARNING: If there is a thunderstorm, skip this. It is extremely exposed to lightning.*</w:t>
-      </w:r>
-    </w:p>
-    <w:p>
-      <w:pPr>
-        <w:pStyle w:val="Heading1"/>
-      </w:pPr>
-      <w:r>
-        <w:t>DAY 4: Mammoth Hot Springs &amp; Departure (Sunday)</w:t>
+        <w:t>THE ULTIMATE WILDLIFE FINALE: Adding Lamar Valley before you head home.</w:t>
       </w:r>
     </w:p>
     <w:p>
@@ -195,7 +200,22 @@
         <w:pStyle w:val="Heading2"/>
       </w:pPr>
       <w:r>
-        <w:t>2. Roosevelt Arch (11:30 AM)</w:t>
+        <w:t>2. Lamar Valley Detour (10:30 AM)</w:t>
+      </w:r>
+    </w:p>
+    <w:p>
+      <w:r>
+        <w:t>- Logistics: Drive East from Mammoth towards the Northeast Entrance.</w:t>
+        <w:br/>
+        <w:t>- Details: This is the "Serengeti of North America". Pull over at any of the wide pullouts and use your binoculars. You are almost guaranteed to see thousands of bison, and this is the absolute best place in the world to spot wild wolves hunting in the distance.</w:t>
+      </w:r>
+    </w:p>
+    <w:p>
+      <w:pPr>
+        <w:pStyle w:val="Heading2"/>
+      </w:pPr>
+      <w:r>
+        <w:t>3. Roosevelt Arch (12:30 PM)</w:t>
       </w:r>
     </w:p>
     <w:p>

</xml_diff>